<commit_message>
Add demo data and final defense assets
</commit_message>
<xml_diff>
--- a/output/final-defense/01-启动报告.docx
+++ b/output/final-defense/01-启动报告.docx
@@ -38,7 +38,12 @@
     </w:p>
     <w:p>
       <w:r>
-        <w:t>本项目建设一个基于 B/S 架构的合同管理系统，覆盖客户维护、合同起草、附件上传、流程分配、会签、定稿、审批、签订、查询统计和操作日志。系统采用 Spring Boot + Vue 3 前后端分离架构，面向课程综合实践的结题验收。</w:t>
+        <w:t>本项目建设一个基于 B/S 架构的合同管理系统，覆盖客户维护、合同起草、附件上传、流程分配、会签、定稿、审批、签订、查询统计和操作日志。系统采用 Spring Boot + Vue 3 前后端分离架构，目标是在课程综合实践结题阶段交付一个可运行、可演示、可验证、可追溯的合同业务系统。</w:t>
+      </w:r>
+    </w:p>
+    <w:p>
+      <w:r>
+        <w:t>启动阶段的管理重点是明确范围边界、角色分工、里程碑计划、验收指标和风险应对。结题阶段在此基础上补齐回退模型、分片续传、模板管理、状态机验证、演示视频和六份 Word 报告，形成完整答辩材料。</w:t>
       </w:r>
     </w:p>
     <w:tbl>
@@ -84,6 +89,74 @@
                 <w:sz w:val="18"/>
               </w:rPr>
               <w:t>内容</w:t>
+            </w:r>
+          </w:p>
+        </w:tc>
+      </w:tr>
+      <w:tr>
+        <w:tc>
+          <w:tcPr>
+            <w:tcW w:type="dxa" w:w="4896"/>
+            <w:vAlign w:val="center"/>
+          </w:tcPr>
+          <w:p>
+            <w:r/>
+            <w:r>
+              <w:rPr>
+                <w:b w:val="0"/>
+                <w:sz w:val="18"/>
+              </w:rPr>
+              <w:t>项目名称</w:t>
+            </w:r>
+          </w:p>
+        </w:tc>
+        <w:tc>
+          <w:tcPr>
+            <w:tcW w:type="dxa" w:w="4896"/>
+            <w:vAlign w:val="center"/>
+          </w:tcPr>
+          <w:p>
+            <w:r/>
+            <w:r>
+              <w:rPr>
+                <w:b w:val="0"/>
+                <w:sz w:val="18"/>
+              </w:rPr>
+              <w:t>ContractSys 合同管理系统</w:t>
+            </w:r>
+          </w:p>
+        </w:tc>
+      </w:tr>
+      <w:tr>
+        <w:tc>
+          <w:tcPr>
+            <w:tcW w:type="dxa" w:w="4896"/>
+            <w:vAlign w:val="center"/>
+          </w:tcPr>
+          <w:p>
+            <w:r/>
+            <w:r>
+              <w:rPr>
+                <w:b w:val="0"/>
+                <w:sz w:val="18"/>
+              </w:rPr>
+              <w:t>技术路线</w:t>
+            </w:r>
+          </w:p>
+        </w:tc>
+        <w:tc>
+          <w:tcPr>
+            <w:tcW w:type="dxa" w:w="4896"/>
+            <w:vAlign w:val="center"/>
+          </w:tcPr>
+          <w:p>
+            <w:r/>
+            <w:r>
+              <w:rPr>
+                <w:b w:val="0"/>
+                <w:sz w:val="18"/>
+              </w:rPr>
+              <w:t>Vue 3 + Spring Boot 3 + Spring Security + Flyway + Docker Compose</w:t>
             </w:r>
           </w:p>
         </w:tc>
@@ -224,6 +297,40 @@
           </w:p>
         </w:tc>
       </w:tr>
+      <w:tr>
+        <w:tc>
+          <w:tcPr>
+            <w:tcW w:type="dxa" w:w="4896"/>
+            <w:vAlign w:val="center"/>
+          </w:tcPr>
+          <w:p>
+            <w:r/>
+            <w:r>
+              <w:rPr>
+                <w:b w:val="0"/>
+                <w:sz w:val="18"/>
+              </w:rPr>
+              <w:t>成员说明</w:t>
+            </w:r>
+          </w:p>
+        </w:tc>
+        <w:tc>
+          <w:tcPr>
+            <w:tcW w:type="dxa" w:w="4896"/>
+            <w:vAlign w:val="center"/>
+          </w:tcPr>
+          <w:p>
+            <w:r/>
+            <w:r>
+              <w:rPr>
+                <w:b w:val="0"/>
+                <w:sz w:val="18"/>
+              </w:rPr>
+              <w:t>PPT 第 13 页给出团队分工和真实姓名：赵杰雄、谷友瑄、王凯、项重善、张浩然；报告按 PPT 出现顺序映射到项目负责人、后端开发、前端开发、测试、数据库/运维。</w:t>
+            </w:r>
+          </w:p>
+        </w:tc>
+      </w:tr>
     </w:tbl>
     <w:p/>
     <w:p>
@@ -231,7 +338,1861 @@
         <w:pStyle w:val="Heading1"/>
       </w:pPr>
       <w:r>
-        <w:t>2. 时间进度安排</w:t>
+        <w:t>2. 启动目标与验收口径</w:t>
+      </w:r>
+    </w:p>
+    <w:tbl>
+      <w:tblPr>
+        <w:tblStyle w:val="TableGrid"/>
+        <w:tblW w:type="auto" w:w="0"/>
+        <w:tblLayout w:type="autofit"/>
+        <w:tblLook w:firstColumn="1" w:firstRow="1" w:lastColumn="0" w:lastRow="0" w:noHBand="0" w:noVBand="1" w:val="04A0"/>
+      </w:tblPr>
+      <w:tblGrid>
+        <w:gridCol w:w="3264"/>
+        <w:gridCol w:w="3264"/>
+        <w:gridCol w:w="3264"/>
+      </w:tblGrid>
+      <w:tr>
+        <w:tc>
+          <w:tcPr>
+            <w:tcW w:type="dxa" w:w="3264"/>
+            <w:shd w:fill="F2F4F7"/>
+            <w:vAlign w:val="center"/>
+          </w:tcPr>
+          <w:p>
+            <w:r/>
+            <w:r>
+              <w:rPr>
+                <w:b/>
+                <w:sz w:val="18"/>
+              </w:rPr>
+              <w:t>目标</w:t>
+            </w:r>
+          </w:p>
+        </w:tc>
+        <w:tc>
+          <w:tcPr>
+            <w:tcW w:type="dxa" w:w="3264"/>
+            <w:shd w:fill="F2F4F7"/>
+            <w:vAlign w:val="center"/>
+          </w:tcPr>
+          <w:p>
+            <w:r/>
+            <w:r>
+              <w:rPr>
+                <w:b/>
+                <w:sz w:val="18"/>
+              </w:rPr>
+              <w:t>启动阶段定义</w:t>
+            </w:r>
+          </w:p>
+        </w:tc>
+        <w:tc>
+          <w:tcPr>
+            <w:tcW w:type="dxa" w:w="3264"/>
+            <w:shd w:fill="F2F4F7"/>
+            <w:vAlign w:val="center"/>
+          </w:tcPr>
+          <w:p>
+            <w:r/>
+            <w:r>
+              <w:rPr>
+                <w:b/>
+                <w:sz w:val="18"/>
+              </w:rPr>
+              <w:t>结题验收标准</w:t>
+            </w:r>
+          </w:p>
+        </w:tc>
+      </w:tr>
+      <w:tr>
+        <w:tc>
+          <w:tcPr>
+            <w:tcW w:type="dxa" w:w="3264"/>
+            <w:vAlign w:val="center"/>
+          </w:tcPr>
+          <w:p>
+            <w:r/>
+            <w:r>
+              <w:rPr>
+                <w:b w:val="0"/>
+                <w:sz w:val="18"/>
+              </w:rPr>
+              <w:t>功能闭环</w:t>
+            </w:r>
+          </w:p>
+        </w:tc>
+        <w:tc>
+          <w:tcPr>
+            <w:tcW w:type="dxa" w:w="3264"/>
+            <w:vAlign w:val="center"/>
+          </w:tcPr>
+          <w:p>
+            <w:r/>
+            <w:r>
+              <w:rPr>
+                <w:b w:val="0"/>
+                <w:sz w:val="18"/>
+              </w:rPr>
+              <w:t>覆盖合同从起草到签订的主流程</w:t>
+            </w:r>
+          </w:p>
+        </w:tc>
+        <w:tc>
+          <w:tcPr>
+            <w:tcW w:type="dxa" w:w="3264"/>
+            <w:vAlign w:val="center"/>
+          </w:tcPr>
+          <w:p>
+            <w:r/>
+            <w:r>
+              <w:rPr>
+                <w:b w:val="0"/>
+                <w:sz w:val="18"/>
+              </w:rPr>
+              <w:t>主流程可演示，且支持打回、撤回、恢复新轮和历史追踪</w:t>
+            </w:r>
+          </w:p>
+        </w:tc>
+      </w:tr>
+      <w:tr>
+        <w:tc>
+          <w:tcPr>
+            <w:tcW w:type="dxa" w:w="3264"/>
+            <w:vAlign w:val="center"/>
+          </w:tcPr>
+          <w:p>
+            <w:r/>
+            <w:r>
+              <w:rPr>
+                <w:b w:val="0"/>
+                <w:sz w:val="18"/>
+              </w:rPr>
+              <w:t>权限控制</w:t>
+            </w:r>
+          </w:p>
+        </w:tc>
+        <w:tc>
+          <w:tcPr>
+            <w:tcW w:type="dxa" w:w="3264"/>
+            <w:vAlign w:val="center"/>
+          </w:tcPr>
+          <w:p>
+            <w:r/>
+            <w:r>
+              <w:rPr>
+                <w:b w:val="0"/>
+                <w:sz w:val="18"/>
+              </w:rPr>
+              <w:t>按管理员、起草人、会签人、审批人、签订人划分职责</w:t>
+            </w:r>
+          </w:p>
+        </w:tc>
+        <w:tc>
+          <w:tcPr>
+            <w:tcW w:type="dxa" w:w="3264"/>
+            <w:vAlign w:val="center"/>
+          </w:tcPr>
+          <w:p>
+            <w:r/>
+            <w:r>
+              <w:rPr>
+                <w:b w:val="0"/>
+                <w:sz w:val="18"/>
+              </w:rPr>
+              <w:t>菜单、路由、接口和业务数据均有权限校验</w:t>
+            </w:r>
+          </w:p>
+        </w:tc>
+      </w:tr>
+      <w:tr>
+        <w:tc>
+          <w:tcPr>
+            <w:tcW w:type="dxa" w:w="3264"/>
+            <w:vAlign w:val="center"/>
+          </w:tcPr>
+          <w:p>
+            <w:r/>
+            <w:r>
+              <w:rPr>
+                <w:b w:val="0"/>
+                <w:sz w:val="18"/>
+              </w:rPr>
+              <w:t>数据可追溯</w:t>
+            </w:r>
+          </w:p>
+        </w:tc>
+        <w:tc>
+          <w:tcPr>
+            <w:tcW w:type="dxa" w:w="3264"/>
+            <w:vAlign w:val="center"/>
+          </w:tcPr>
+          <w:p>
+            <w:r/>
+            <w:r>
+              <w:rPr>
+                <w:b w:val="0"/>
+                <w:sz w:val="18"/>
+              </w:rPr>
+              <w:t>合同状态、任务处理、日志需要留痕</w:t>
+            </w:r>
+          </w:p>
+        </w:tc>
+        <w:tc>
+          <w:tcPr>
+            <w:tcW w:type="dxa" w:w="3264"/>
+            <w:vAlign w:val="center"/>
+          </w:tcPr>
+          <w:p>
+            <w:r/>
+            <w:r>
+              <w:rPr>
+                <w:b w:val="0"/>
+                <w:sz w:val="18"/>
+              </w:rPr>
+              <w:t>状态历史、任务轮次、版本历史、操作日志均可查询</w:t>
+            </w:r>
+          </w:p>
+        </w:tc>
+      </w:tr>
+      <w:tr>
+        <w:tc>
+          <w:tcPr>
+            <w:tcW w:type="dxa" w:w="3264"/>
+            <w:vAlign w:val="center"/>
+          </w:tcPr>
+          <w:p>
+            <w:r/>
+            <w:r>
+              <w:rPr>
+                <w:b w:val="0"/>
+                <w:sz w:val="18"/>
+              </w:rPr>
+              <w:t>附件能力</w:t>
+            </w:r>
+          </w:p>
+        </w:tc>
+        <w:tc>
+          <w:tcPr>
+            <w:tcW w:type="dxa" w:w="3264"/>
+            <w:vAlign w:val="center"/>
+          </w:tcPr>
+          <w:p>
+            <w:r/>
+            <w:r>
+              <w:rPr>
+                <w:b w:val="0"/>
+                <w:sz w:val="18"/>
+              </w:rPr>
+              <w:t>支持常见合同附件上传下载</w:t>
+            </w:r>
+          </w:p>
+        </w:tc>
+        <w:tc>
+          <w:tcPr>
+            <w:tcW w:type="dxa" w:w="3264"/>
+            <w:vAlign w:val="center"/>
+          </w:tcPr>
+          <w:p>
+            <w:r/>
+            <w:r>
+              <w:rPr>
+                <w:b w:val="0"/>
+                <w:sz w:val="18"/>
+              </w:rPr>
+              <w:t>增加文件魔数校验、分片上传、续传查询和合并入库</w:t>
+            </w:r>
+          </w:p>
+        </w:tc>
+      </w:tr>
+      <w:tr>
+        <w:tc>
+          <w:tcPr>
+            <w:tcW w:type="dxa" w:w="3264"/>
+            <w:vAlign w:val="center"/>
+          </w:tcPr>
+          <w:p>
+            <w:r/>
+            <w:r>
+              <w:rPr>
+                <w:b w:val="0"/>
+                <w:sz w:val="18"/>
+              </w:rPr>
+              <w:t>工程交付</w:t>
+            </w:r>
+          </w:p>
+        </w:tc>
+        <w:tc>
+          <w:tcPr>
+            <w:tcW w:type="dxa" w:w="3264"/>
+            <w:vAlign w:val="center"/>
+          </w:tcPr>
+          <w:p>
+            <w:r/>
+            <w:r>
+              <w:rPr>
+                <w:b w:val="0"/>
+                <w:sz w:val="18"/>
+              </w:rPr>
+              <w:t>本地可运行，文档可用于答辩</w:t>
+            </w:r>
+          </w:p>
+        </w:tc>
+        <w:tc>
+          <w:tcPr>
+            <w:tcW w:type="dxa" w:w="3264"/>
+            <w:vAlign w:val="center"/>
+          </w:tcPr>
+          <w:p>
+            <w:r/>
+            <w:r>
+              <w:rPr>
+                <w:b w:val="0"/>
+                <w:sz w:val="18"/>
+              </w:rPr>
+              <w:t>提供启动脚本、Docker 编排、测试报告、PPT、MP4 和用户手册</w:t>
+            </w:r>
+          </w:p>
+        </w:tc>
+      </w:tr>
+    </w:tbl>
+    <w:p/>
+    <w:p>
+      <w:pPr>
+        <w:pStyle w:val="Heading1"/>
+      </w:pPr>
+      <w:r>
+        <w:t>3. 代码规模与组成分析</w:t>
+      </w:r>
+    </w:p>
+    <w:p>
+      <w:r>
+        <w:t>按源代码统计口径排除 node_modules、target、dist、output、outputs、.git 和 .codegraph 等依赖/构建/交付产物后，项目有效文件共 186 个，总代码与文档行数 16739 行。该口径覆盖 backend、frontend、scripts、docs 以及根目录必要配置。</w:t>
+      </w:r>
+    </w:p>
+    <w:tbl>
+      <w:tblPr>
+        <w:tblStyle w:val="TableGrid"/>
+        <w:tblW w:type="auto" w:w="0"/>
+        <w:tblLayout w:type="autofit"/>
+        <w:tblLook w:firstColumn="1" w:firstRow="1" w:lastColumn="0" w:lastRow="0" w:noHBand="0" w:noVBand="1" w:val="04A0"/>
+      </w:tblPr>
+      <w:tblGrid>
+        <w:gridCol w:w="1632"/>
+        <w:gridCol w:w="1632"/>
+        <w:gridCol w:w="1632"/>
+        <w:gridCol w:w="1632"/>
+        <w:gridCol w:w="1632"/>
+        <w:gridCol w:w="1632"/>
+      </w:tblGrid>
+      <w:tr>
+        <w:tc>
+          <w:tcPr>
+            <w:tcW w:type="dxa" w:w="1632"/>
+            <w:shd w:fill="F2F4F7"/>
+            <w:vAlign w:val="center"/>
+          </w:tcPr>
+          <w:p>
+            <w:r/>
+            <w:r>
+              <w:rPr>
+                <w:b/>
+                <w:sz w:val="18"/>
+              </w:rPr>
+              <w:t>组成</w:t>
+            </w:r>
+          </w:p>
+        </w:tc>
+        <w:tc>
+          <w:tcPr>
+            <w:tcW w:type="dxa" w:w="1632"/>
+            <w:shd w:fill="F2F4F7"/>
+            <w:vAlign w:val="center"/>
+          </w:tcPr>
+          <w:p>
+            <w:r/>
+            <w:r>
+              <w:rPr>
+                <w:b/>
+                <w:sz w:val="18"/>
+              </w:rPr>
+              <w:t>目录/文件</w:t>
+            </w:r>
+          </w:p>
+        </w:tc>
+        <w:tc>
+          <w:tcPr>
+            <w:tcW w:type="dxa" w:w="1632"/>
+            <w:shd w:fill="F2F4F7"/>
+            <w:vAlign w:val="center"/>
+          </w:tcPr>
+          <w:p>
+            <w:r/>
+            <w:r>
+              <w:rPr>
+                <w:b/>
+                <w:sz w:val="18"/>
+              </w:rPr>
+              <w:t>文件数</w:t>
+            </w:r>
+          </w:p>
+        </w:tc>
+        <w:tc>
+          <w:tcPr>
+            <w:tcW w:type="dxa" w:w="1632"/>
+            <w:shd w:fill="F2F4F7"/>
+            <w:vAlign w:val="center"/>
+          </w:tcPr>
+          <w:p>
+            <w:r/>
+            <w:r>
+              <w:rPr>
+                <w:b/>
+                <w:sz w:val="18"/>
+              </w:rPr>
+              <w:t>行数</w:t>
+            </w:r>
+          </w:p>
+        </w:tc>
+        <w:tc>
+          <w:tcPr>
+            <w:tcW w:type="dxa" w:w="1632"/>
+            <w:shd w:fill="F2F4F7"/>
+            <w:vAlign w:val="center"/>
+          </w:tcPr>
+          <w:p>
+            <w:r/>
+            <w:r>
+              <w:rPr>
+                <w:b/>
+                <w:sz w:val="18"/>
+              </w:rPr>
+              <w:t>占比</w:t>
+            </w:r>
+          </w:p>
+        </w:tc>
+        <w:tc>
+          <w:tcPr>
+            <w:tcW w:type="dxa" w:w="1632"/>
+            <w:shd w:fill="F2F4F7"/>
+            <w:vAlign w:val="center"/>
+          </w:tcPr>
+          <w:p>
+            <w:r/>
+            <w:r>
+              <w:rPr>
+                <w:b/>
+                <w:sz w:val="18"/>
+              </w:rPr>
+              <w:t>说明</w:t>
+            </w:r>
+          </w:p>
+        </w:tc>
+      </w:tr>
+      <w:tr>
+        <w:tc>
+          <w:tcPr>
+            <w:tcW w:type="dxa" w:w="1632"/>
+            <w:vAlign w:val="center"/>
+          </w:tcPr>
+          <w:p>
+            <w:r/>
+            <w:r>
+              <w:rPr>
+                <w:b w:val="0"/>
+                <w:sz w:val="18"/>
+              </w:rPr>
+              <w:t>后端工程</w:t>
+            </w:r>
+          </w:p>
+        </w:tc>
+        <w:tc>
+          <w:tcPr>
+            <w:tcW w:type="dxa" w:w="1632"/>
+            <w:vAlign w:val="center"/>
+          </w:tcPr>
+          <w:p>
+            <w:r/>
+            <w:r>
+              <w:rPr>
+                <w:b w:val="0"/>
+                <w:sz w:val="18"/>
+              </w:rPr>
+              <w:t>backend</w:t>
+            </w:r>
+          </w:p>
+        </w:tc>
+        <w:tc>
+          <w:tcPr>
+            <w:tcW w:type="dxa" w:w="1632"/>
+            <w:vAlign w:val="center"/>
+          </w:tcPr>
+          <w:p>
+            <w:r/>
+            <w:r>
+              <w:rPr>
+                <w:b w:val="0"/>
+                <w:sz w:val="18"/>
+              </w:rPr>
+              <w:t>132</w:t>
+            </w:r>
+          </w:p>
+        </w:tc>
+        <w:tc>
+          <w:tcPr>
+            <w:tcW w:type="dxa" w:w="1632"/>
+            <w:vAlign w:val="center"/>
+          </w:tcPr>
+          <w:p>
+            <w:r/>
+            <w:r>
+              <w:rPr>
+                <w:b w:val="0"/>
+                <w:sz w:val="18"/>
+              </w:rPr>
+              <w:t>8429</w:t>
+            </w:r>
+          </w:p>
+        </w:tc>
+        <w:tc>
+          <w:tcPr>
+            <w:tcW w:type="dxa" w:w="1632"/>
+            <w:vAlign w:val="center"/>
+          </w:tcPr>
+          <w:p>
+            <w:r/>
+            <w:r>
+              <w:rPr>
+                <w:b w:val="0"/>
+                <w:sz w:val="18"/>
+              </w:rPr>
+              <w:t>50.4%</w:t>
+            </w:r>
+          </w:p>
+        </w:tc>
+        <w:tc>
+          <w:tcPr>
+            <w:tcW w:type="dxa" w:w="1632"/>
+            <w:vAlign w:val="center"/>
+          </w:tcPr>
+          <w:p>
+            <w:r/>
+            <w:r>
+              <w:rPr>
+                <w:b w:val="0"/>
+                <w:sz w:val="18"/>
+              </w:rPr>
+              <w:t>Spring Boot 业务、权限、工作流、附件、测试与数据库迁移</w:t>
+            </w:r>
+          </w:p>
+        </w:tc>
+      </w:tr>
+      <w:tr>
+        <w:tc>
+          <w:tcPr>
+            <w:tcW w:type="dxa" w:w="1632"/>
+            <w:vAlign w:val="center"/>
+          </w:tcPr>
+          <w:p>
+            <w:r/>
+            <w:r>
+              <w:rPr>
+                <w:b w:val="0"/>
+                <w:sz w:val="18"/>
+              </w:rPr>
+              <w:t>前端工程</w:t>
+            </w:r>
+          </w:p>
+        </w:tc>
+        <w:tc>
+          <w:tcPr>
+            <w:tcW w:type="dxa" w:w="1632"/>
+            <w:vAlign w:val="center"/>
+          </w:tcPr>
+          <w:p>
+            <w:r/>
+            <w:r>
+              <w:rPr>
+                <w:b w:val="0"/>
+                <w:sz w:val="18"/>
+              </w:rPr>
+              <w:t>frontend</w:t>
+            </w:r>
+          </w:p>
+        </w:tc>
+        <w:tc>
+          <w:tcPr>
+            <w:tcW w:type="dxa" w:w="1632"/>
+            <w:vAlign w:val="center"/>
+          </w:tcPr>
+          <w:p>
+            <w:r/>
+            <w:r>
+              <w:rPr>
+                <w:b w:val="0"/>
+                <w:sz w:val="18"/>
+              </w:rPr>
+              <w:t>27</w:t>
+            </w:r>
+          </w:p>
+        </w:tc>
+        <w:tc>
+          <w:tcPr>
+            <w:tcW w:type="dxa" w:w="1632"/>
+            <w:vAlign w:val="center"/>
+          </w:tcPr>
+          <w:p>
+            <w:r/>
+            <w:r>
+              <w:rPr>
+                <w:b w:val="0"/>
+                <w:sz w:val="18"/>
+              </w:rPr>
+              <w:t>4143</w:t>
+            </w:r>
+          </w:p>
+        </w:tc>
+        <w:tc>
+          <w:tcPr>
+            <w:tcW w:type="dxa" w:w="1632"/>
+            <w:vAlign w:val="center"/>
+          </w:tcPr>
+          <w:p>
+            <w:r/>
+            <w:r>
+              <w:rPr>
+                <w:b w:val="0"/>
+                <w:sz w:val="18"/>
+              </w:rPr>
+              <w:t>24.7%</w:t>
+            </w:r>
+          </w:p>
+        </w:tc>
+        <w:tc>
+          <w:tcPr>
+            <w:tcW w:type="dxa" w:w="1632"/>
+            <w:vAlign w:val="center"/>
+          </w:tcPr>
+          <w:p>
+            <w:r/>
+            <w:r>
+              <w:rPr>
+                <w:b w:val="0"/>
+                <w:sz w:val="18"/>
+              </w:rPr>
+              <w:t>Vue 3 页面、路由权限、合同流程交互和样式</w:t>
+            </w:r>
+          </w:p>
+        </w:tc>
+      </w:tr>
+      <w:tr>
+        <w:tc>
+          <w:tcPr>
+            <w:tcW w:type="dxa" w:w="1632"/>
+            <w:vAlign w:val="center"/>
+          </w:tcPr>
+          <w:p>
+            <w:r/>
+            <w:r>
+              <w:rPr>
+                <w:b w:val="0"/>
+                <w:sz w:val="18"/>
+              </w:rPr>
+              <w:t>项目文档</w:t>
+            </w:r>
+          </w:p>
+        </w:tc>
+        <w:tc>
+          <w:tcPr>
+            <w:tcW w:type="dxa" w:w="1632"/>
+            <w:vAlign w:val="center"/>
+          </w:tcPr>
+          <w:p>
+            <w:r/>
+            <w:r>
+              <w:rPr>
+                <w:b w:val="0"/>
+                <w:sz w:val="18"/>
+              </w:rPr>
+              <w:t>docs</w:t>
+            </w:r>
+          </w:p>
+        </w:tc>
+        <w:tc>
+          <w:tcPr>
+            <w:tcW w:type="dxa" w:w="1632"/>
+            <w:vAlign w:val="center"/>
+          </w:tcPr>
+          <w:p>
+            <w:r/>
+            <w:r>
+              <w:rPr>
+                <w:b w:val="0"/>
+                <w:sz w:val="18"/>
+              </w:rPr>
+              <w:t>17</w:t>
+            </w:r>
+          </w:p>
+        </w:tc>
+        <w:tc>
+          <w:tcPr>
+            <w:tcW w:type="dxa" w:w="1632"/>
+            <w:vAlign w:val="center"/>
+          </w:tcPr>
+          <w:p>
+            <w:r/>
+            <w:r>
+              <w:rPr>
+                <w:b w:val="0"/>
+                <w:sz w:val="18"/>
+              </w:rPr>
+              <w:t>2177</w:t>
+            </w:r>
+          </w:p>
+        </w:tc>
+        <w:tc>
+          <w:tcPr>
+            <w:tcW w:type="dxa" w:w="1632"/>
+            <w:vAlign w:val="center"/>
+          </w:tcPr>
+          <w:p>
+            <w:r/>
+            <w:r>
+              <w:rPr>
+                <w:b w:val="0"/>
+                <w:sz w:val="18"/>
+              </w:rPr>
+              <w:t>13.0%</w:t>
+            </w:r>
+          </w:p>
+        </w:tc>
+        <w:tc>
+          <w:tcPr>
+            <w:tcW w:type="dxa" w:w="1632"/>
+            <w:vAlign w:val="center"/>
+          </w:tcPr>
+          <w:p>
+            <w:r/>
+            <w:r>
+              <w:rPr>
+                <w:b w:val="0"/>
+                <w:sz w:val="18"/>
+              </w:rPr>
+              <w:t>计划、架构、测试问题、扩展设计和代码审查记录</w:t>
+            </w:r>
+          </w:p>
+        </w:tc>
+      </w:tr>
+      <w:tr>
+        <w:tc>
+          <w:tcPr>
+            <w:tcW w:type="dxa" w:w="1632"/>
+            <w:vAlign w:val="center"/>
+          </w:tcPr>
+          <w:p>
+            <w:r/>
+            <w:r>
+              <w:rPr>
+                <w:b w:val="0"/>
+                <w:sz w:val="18"/>
+              </w:rPr>
+              <w:t>脚本工具</w:t>
+            </w:r>
+          </w:p>
+        </w:tc>
+        <w:tc>
+          <w:tcPr>
+            <w:tcW w:type="dxa" w:w="1632"/>
+            <w:vAlign w:val="center"/>
+          </w:tcPr>
+          <w:p>
+            <w:r/>
+            <w:r>
+              <w:rPr>
+                <w:b w:val="0"/>
+                <w:sz w:val="18"/>
+              </w:rPr>
+              <w:t>scripts</w:t>
+            </w:r>
+          </w:p>
+        </w:tc>
+        <w:tc>
+          <w:tcPr>
+            <w:tcW w:type="dxa" w:w="1632"/>
+            <w:vAlign w:val="center"/>
+          </w:tcPr>
+          <w:p>
+            <w:r/>
+            <w:r>
+              <w:rPr>
+                <w:b w:val="0"/>
+                <w:sz w:val="18"/>
+              </w:rPr>
+              <w:t>7</w:t>
+            </w:r>
+          </w:p>
+        </w:tc>
+        <w:tc>
+          <w:tcPr>
+            <w:tcW w:type="dxa" w:w="1632"/>
+            <w:vAlign w:val="center"/>
+          </w:tcPr>
+          <w:p>
+            <w:r/>
+            <w:r>
+              <w:rPr>
+                <w:b w:val="0"/>
+                <w:sz w:val="18"/>
+              </w:rPr>
+              <w:t>1532</w:t>
+            </w:r>
+          </w:p>
+        </w:tc>
+        <w:tc>
+          <w:tcPr>
+            <w:tcW w:type="dxa" w:w="1632"/>
+            <w:vAlign w:val="center"/>
+          </w:tcPr>
+          <w:p>
+            <w:r/>
+            <w:r>
+              <w:rPr>
+                <w:b w:val="0"/>
+                <w:sz w:val="18"/>
+              </w:rPr>
+              <w:t>9.2%</w:t>
+            </w:r>
+          </w:p>
+        </w:tc>
+        <w:tc>
+          <w:tcPr>
+            <w:tcW w:type="dxa" w:w="1632"/>
+            <w:vAlign w:val="center"/>
+          </w:tcPr>
+          <w:p>
+            <w:r/>
+            <w:r>
+              <w:rPr>
+                <w:b w:val="0"/>
+                <w:sz w:val="18"/>
+              </w:rPr>
+              <w:t>一键启动、停止、演示数据、状态机验证和冒烟检查</w:t>
+            </w:r>
+          </w:p>
+        </w:tc>
+      </w:tr>
+      <w:tr>
+        <w:tc>
+          <w:tcPr>
+            <w:tcW w:type="dxa" w:w="1632"/>
+            <w:vAlign w:val="center"/>
+          </w:tcPr>
+          <w:p>
+            <w:r/>
+            <w:r>
+              <w:rPr>
+                <w:b w:val="0"/>
+                <w:sz w:val="18"/>
+              </w:rPr>
+              <w:t>根目录配置</w:t>
+            </w:r>
+          </w:p>
+        </w:tc>
+        <w:tc>
+          <w:tcPr>
+            <w:tcW w:type="dxa" w:w="1632"/>
+            <w:vAlign w:val="center"/>
+          </w:tcPr>
+          <w:p>
+            <w:r/>
+            <w:r>
+              <w:rPr>
+                <w:b w:val="0"/>
+                <w:sz w:val="18"/>
+              </w:rPr>
+              <w:t>docker-compose.yml / README 等</w:t>
+            </w:r>
+          </w:p>
+        </w:tc>
+        <w:tc>
+          <w:tcPr>
+            <w:tcW w:type="dxa" w:w="1632"/>
+            <w:vAlign w:val="center"/>
+          </w:tcPr>
+          <w:p>
+            <w:r/>
+            <w:r>
+              <w:rPr>
+                <w:b w:val="0"/>
+                <w:sz w:val="18"/>
+              </w:rPr>
+              <w:t>3</w:t>
+            </w:r>
+          </w:p>
+        </w:tc>
+        <w:tc>
+          <w:tcPr>
+            <w:tcW w:type="dxa" w:w="1632"/>
+            <w:vAlign w:val="center"/>
+          </w:tcPr>
+          <w:p>
+            <w:r/>
+            <w:r>
+              <w:rPr>
+                <w:b w:val="0"/>
+                <w:sz w:val="18"/>
+              </w:rPr>
+              <w:t>458</w:t>
+            </w:r>
+          </w:p>
+        </w:tc>
+        <w:tc>
+          <w:tcPr>
+            <w:tcW w:type="dxa" w:w="1632"/>
+            <w:vAlign w:val="center"/>
+          </w:tcPr>
+          <w:p>
+            <w:r/>
+            <w:r>
+              <w:rPr>
+                <w:b w:val="0"/>
+                <w:sz w:val="18"/>
+              </w:rPr>
+              <w:t>2.7%</w:t>
+            </w:r>
+          </w:p>
+        </w:tc>
+        <w:tc>
+          <w:tcPr>
+            <w:tcW w:type="dxa" w:w="1632"/>
+            <w:vAlign w:val="center"/>
+          </w:tcPr>
+          <w:p>
+            <w:r/>
+            <w:r>
+              <w:rPr>
+                <w:b w:val="0"/>
+                <w:sz w:val="18"/>
+              </w:rPr>
+              <w:t>部署编排、项目说明和运行配置</w:t>
+            </w:r>
+          </w:p>
+        </w:tc>
+      </w:tr>
+    </w:tbl>
+    <w:p/>
+    <w:tbl>
+      <w:tblPr>
+        <w:tblStyle w:val="TableGrid"/>
+        <w:tblW w:type="auto" w:w="0"/>
+        <w:tblLayout w:type="autofit"/>
+        <w:tblLook w:firstColumn="1" w:firstRow="1" w:lastColumn="0" w:lastRow="0" w:noHBand="0" w:noVBand="1" w:val="04A0"/>
+      </w:tblPr>
+      <w:tblGrid>
+        <w:gridCol w:w="1632"/>
+        <w:gridCol w:w="1632"/>
+        <w:gridCol w:w="1632"/>
+        <w:gridCol w:w="1632"/>
+        <w:gridCol w:w="1632"/>
+        <w:gridCol w:w="1632"/>
+      </w:tblGrid>
+      <w:tr>
+        <w:tc>
+          <w:tcPr>
+            <w:tcW w:type="dxa" w:w="1632"/>
+            <w:shd w:fill="F2F4F7"/>
+            <w:vAlign w:val="center"/>
+          </w:tcPr>
+          <w:p>
+            <w:r/>
+            <w:r>
+              <w:rPr>
+                <w:b/>
+                <w:sz w:val="18"/>
+              </w:rPr>
+              <w:t>语言/类型</w:t>
+            </w:r>
+          </w:p>
+        </w:tc>
+        <w:tc>
+          <w:tcPr>
+            <w:tcW w:type="dxa" w:w="1632"/>
+            <w:shd w:fill="F2F4F7"/>
+            <w:vAlign w:val="center"/>
+          </w:tcPr>
+          <w:p>
+            <w:r/>
+            <w:r>
+              <w:rPr>
+                <w:b/>
+                <w:sz w:val="18"/>
+              </w:rPr>
+              <w:t>扩展名</w:t>
+            </w:r>
+          </w:p>
+        </w:tc>
+        <w:tc>
+          <w:tcPr>
+            <w:tcW w:type="dxa" w:w="1632"/>
+            <w:shd w:fill="F2F4F7"/>
+            <w:vAlign w:val="center"/>
+          </w:tcPr>
+          <w:p>
+            <w:r/>
+            <w:r>
+              <w:rPr>
+                <w:b/>
+                <w:sz w:val="18"/>
+              </w:rPr>
+              <w:t>文件数</w:t>
+            </w:r>
+          </w:p>
+        </w:tc>
+        <w:tc>
+          <w:tcPr>
+            <w:tcW w:type="dxa" w:w="1632"/>
+            <w:shd w:fill="F2F4F7"/>
+            <w:vAlign w:val="center"/>
+          </w:tcPr>
+          <w:p>
+            <w:r/>
+            <w:r>
+              <w:rPr>
+                <w:b/>
+                <w:sz w:val="18"/>
+              </w:rPr>
+              <w:t>行数</w:t>
+            </w:r>
+          </w:p>
+        </w:tc>
+        <w:tc>
+          <w:tcPr>
+            <w:tcW w:type="dxa" w:w="1632"/>
+            <w:shd w:fill="F2F4F7"/>
+            <w:vAlign w:val="center"/>
+          </w:tcPr>
+          <w:p>
+            <w:r/>
+            <w:r>
+              <w:rPr>
+                <w:b/>
+                <w:sz w:val="18"/>
+              </w:rPr>
+              <w:t>占比</w:t>
+            </w:r>
+          </w:p>
+        </w:tc>
+        <w:tc>
+          <w:tcPr>
+            <w:tcW w:type="dxa" w:w="1632"/>
+            <w:shd w:fill="F2F4F7"/>
+            <w:vAlign w:val="center"/>
+          </w:tcPr>
+          <w:p>
+            <w:r/>
+            <w:r>
+              <w:rPr>
+                <w:b/>
+                <w:sz w:val="18"/>
+              </w:rPr>
+              <w:t>用途</w:t>
+            </w:r>
+          </w:p>
+        </w:tc>
+      </w:tr>
+      <w:tr>
+        <w:tc>
+          <w:tcPr>
+            <w:tcW w:type="dxa" w:w="1632"/>
+            <w:vAlign w:val="center"/>
+          </w:tcPr>
+          <w:p>
+            <w:r/>
+            <w:r>
+              <w:rPr>
+                <w:b w:val="0"/>
+                <w:sz w:val="18"/>
+              </w:rPr>
+              <w:t>Java</w:t>
+            </w:r>
+          </w:p>
+        </w:tc>
+        <w:tc>
+          <w:tcPr>
+            <w:tcW w:type="dxa" w:w="1632"/>
+            <w:vAlign w:val="center"/>
+          </w:tcPr>
+          <w:p>
+            <w:r/>
+            <w:r>
+              <w:rPr>
+                <w:b w:val="0"/>
+                <w:sz w:val="18"/>
+              </w:rPr>
+              <w:t>.java</w:t>
+            </w:r>
+          </w:p>
+        </w:tc>
+        <w:tc>
+          <w:tcPr>
+            <w:tcW w:type="dxa" w:w="1632"/>
+            <w:vAlign w:val="center"/>
+          </w:tcPr>
+          <w:p>
+            <w:r/>
+            <w:r>
+              <w:rPr>
+                <w:b w:val="0"/>
+                <w:sz w:val="18"/>
+              </w:rPr>
+              <w:t>115</w:t>
+            </w:r>
+          </w:p>
+        </w:tc>
+        <w:tc>
+          <w:tcPr>
+            <w:tcW w:type="dxa" w:w="1632"/>
+            <w:vAlign w:val="center"/>
+          </w:tcPr>
+          <w:p>
+            <w:r/>
+            <w:r>
+              <w:rPr>
+                <w:b w:val="0"/>
+                <w:sz w:val="18"/>
+              </w:rPr>
+              <w:t>7641</w:t>
+            </w:r>
+          </w:p>
+        </w:tc>
+        <w:tc>
+          <w:tcPr>
+            <w:tcW w:type="dxa" w:w="1632"/>
+            <w:vAlign w:val="center"/>
+          </w:tcPr>
+          <w:p>
+            <w:r/>
+            <w:r>
+              <w:rPr>
+                <w:b w:val="0"/>
+                <w:sz w:val="18"/>
+              </w:rPr>
+              <w:t>45.6%</w:t>
+            </w:r>
+          </w:p>
+        </w:tc>
+        <w:tc>
+          <w:tcPr>
+            <w:tcW w:type="dxa" w:w="1632"/>
+            <w:vAlign w:val="center"/>
+          </w:tcPr>
+          <w:p>
+            <w:r/>
+            <w:r>
+              <w:rPr>
+                <w:b w:val="0"/>
+                <w:sz w:val="18"/>
+              </w:rPr>
+              <w:t>后端业务主体、测试和安全配置</w:t>
+            </w:r>
+          </w:p>
+        </w:tc>
+      </w:tr>
+      <w:tr>
+        <w:tc>
+          <w:tcPr>
+            <w:tcW w:type="dxa" w:w="1632"/>
+            <w:vAlign w:val="center"/>
+          </w:tcPr>
+          <w:p>
+            <w:r/>
+            <w:r>
+              <w:rPr>
+                <w:b w:val="0"/>
+                <w:sz w:val="18"/>
+              </w:rPr>
+              <w:t>Vue</w:t>
+            </w:r>
+          </w:p>
+        </w:tc>
+        <w:tc>
+          <w:tcPr>
+            <w:tcW w:type="dxa" w:w="1632"/>
+            <w:vAlign w:val="center"/>
+          </w:tcPr>
+          <w:p>
+            <w:r/>
+            <w:r>
+              <w:rPr>
+                <w:b w:val="0"/>
+                <w:sz w:val="18"/>
+              </w:rPr>
+              <w:t>.vue</w:t>
+            </w:r>
+          </w:p>
+        </w:tc>
+        <w:tc>
+          <w:tcPr>
+            <w:tcW w:type="dxa" w:w="1632"/>
+            <w:vAlign w:val="center"/>
+          </w:tcPr>
+          <w:p>
+            <w:r/>
+            <w:r>
+              <w:rPr>
+                <w:b w:val="0"/>
+                <w:sz w:val="18"/>
+              </w:rPr>
+              <w:t>19</w:t>
+            </w:r>
+          </w:p>
+        </w:tc>
+        <w:tc>
+          <w:tcPr>
+            <w:tcW w:type="dxa" w:w="1632"/>
+            <w:vAlign w:val="center"/>
+          </w:tcPr>
+          <w:p>
+            <w:r/>
+            <w:r>
+              <w:rPr>
+                <w:b w:val="0"/>
+                <w:sz w:val="18"/>
+              </w:rPr>
+              <w:t>3018</w:t>
+            </w:r>
+          </w:p>
+        </w:tc>
+        <w:tc>
+          <w:tcPr>
+            <w:tcW w:type="dxa" w:w="1632"/>
+            <w:vAlign w:val="center"/>
+          </w:tcPr>
+          <w:p>
+            <w:r/>
+            <w:r>
+              <w:rPr>
+                <w:b w:val="0"/>
+                <w:sz w:val="18"/>
+              </w:rPr>
+              <w:t>18.0%</w:t>
+            </w:r>
+          </w:p>
+        </w:tc>
+        <w:tc>
+          <w:tcPr>
+            <w:tcW w:type="dxa" w:w="1632"/>
+            <w:vAlign w:val="center"/>
+          </w:tcPr>
+          <w:p>
+            <w:r/>
+            <w:r>
+              <w:rPr>
+                <w:b w:val="0"/>
+                <w:sz w:val="18"/>
+              </w:rPr>
+              <w:t>前端页面和组件</w:t>
+            </w:r>
+          </w:p>
+        </w:tc>
+      </w:tr>
+      <w:tr>
+        <w:tc>
+          <w:tcPr>
+            <w:tcW w:type="dxa" w:w="1632"/>
+            <w:vAlign w:val="center"/>
+          </w:tcPr>
+          <w:p>
+            <w:r/>
+            <w:r>
+              <w:rPr>
+                <w:b w:val="0"/>
+                <w:sz w:val="18"/>
+              </w:rPr>
+              <w:t>Markdown</w:t>
+            </w:r>
+          </w:p>
+        </w:tc>
+        <w:tc>
+          <w:tcPr>
+            <w:tcW w:type="dxa" w:w="1632"/>
+            <w:vAlign w:val="center"/>
+          </w:tcPr>
+          <w:p>
+            <w:r/>
+            <w:r>
+              <w:rPr>
+                <w:b w:val="0"/>
+                <w:sz w:val="18"/>
+              </w:rPr>
+              <w:t>.md</w:t>
+            </w:r>
+          </w:p>
+        </w:tc>
+        <w:tc>
+          <w:tcPr>
+            <w:tcW w:type="dxa" w:w="1632"/>
+            <w:vAlign w:val="center"/>
+          </w:tcPr>
+          <w:p>
+            <w:r/>
+            <w:r>
+              <w:rPr>
+                <w:b w:val="0"/>
+                <w:sz w:val="18"/>
+              </w:rPr>
+              <w:t>19</w:t>
+            </w:r>
+          </w:p>
+        </w:tc>
+        <w:tc>
+          <w:tcPr>
+            <w:tcW w:type="dxa" w:w="1632"/>
+            <w:vAlign w:val="center"/>
+          </w:tcPr>
+          <w:p>
+            <w:r/>
+            <w:r>
+              <w:rPr>
+                <w:b w:val="0"/>
+                <w:sz w:val="18"/>
+              </w:rPr>
+              <w:t>2539</w:t>
+            </w:r>
+          </w:p>
+        </w:tc>
+        <w:tc>
+          <w:tcPr>
+            <w:tcW w:type="dxa" w:w="1632"/>
+            <w:vAlign w:val="center"/>
+          </w:tcPr>
+          <w:p>
+            <w:r/>
+            <w:r>
+              <w:rPr>
+                <w:b w:val="0"/>
+                <w:sz w:val="18"/>
+              </w:rPr>
+              <w:t>15.2%</w:t>
+            </w:r>
+          </w:p>
+        </w:tc>
+        <w:tc>
+          <w:tcPr>
+            <w:tcW w:type="dxa" w:w="1632"/>
+            <w:vAlign w:val="center"/>
+          </w:tcPr>
+          <w:p>
+            <w:r/>
+            <w:r>
+              <w:rPr>
+                <w:b w:val="0"/>
+                <w:sz w:val="18"/>
+              </w:rPr>
+              <w:t>过程文档与答辩素材依据</w:t>
+            </w:r>
+          </w:p>
+        </w:tc>
+      </w:tr>
+      <w:tr>
+        <w:tc>
+          <w:tcPr>
+            <w:tcW w:type="dxa" w:w="1632"/>
+            <w:vAlign w:val="center"/>
+          </w:tcPr>
+          <w:p>
+            <w:r/>
+            <w:r>
+              <w:rPr>
+                <w:b w:val="0"/>
+                <w:sz w:val="18"/>
+              </w:rPr>
+              <w:t>PowerShell</w:t>
+            </w:r>
+          </w:p>
+        </w:tc>
+        <w:tc>
+          <w:tcPr>
+            <w:tcW w:type="dxa" w:w="1632"/>
+            <w:vAlign w:val="center"/>
+          </w:tcPr>
+          <w:p>
+            <w:r/>
+            <w:r>
+              <w:rPr>
+                <w:b w:val="0"/>
+                <w:sz w:val="18"/>
+              </w:rPr>
+              <w:t>.ps1</w:t>
+            </w:r>
+          </w:p>
+        </w:tc>
+        <w:tc>
+          <w:tcPr>
+            <w:tcW w:type="dxa" w:w="1632"/>
+            <w:vAlign w:val="center"/>
+          </w:tcPr>
+          <w:p>
+            <w:r/>
+            <w:r>
+              <w:rPr>
+                <w:b w:val="0"/>
+                <w:sz w:val="18"/>
+              </w:rPr>
+              <w:t>6</w:t>
+            </w:r>
+          </w:p>
+        </w:tc>
+        <w:tc>
+          <w:tcPr>
+            <w:tcW w:type="dxa" w:w="1632"/>
+            <w:vAlign w:val="center"/>
+          </w:tcPr>
+          <w:p>
+            <w:r/>
+            <w:r>
+              <w:rPr>
+                <w:b w:val="0"/>
+                <w:sz w:val="18"/>
+              </w:rPr>
+              <w:t>1173</w:t>
+            </w:r>
+          </w:p>
+        </w:tc>
+        <w:tc>
+          <w:tcPr>
+            <w:tcW w:type="dxa" w:w="1632"/>
+            <w:vAlign w:val="center"/>
+          </w:tcPr>
+          <w:p>
+            <w:r/>
+            <w:r>
+              <w:rPr>
+                <w:b w:val="0"/>
+                <w:sz w:val="18"/>
+              </w:rPr>
+              <w:t>7.0%</w:t>
+            </w:r>
+          </w:p>
+        </w:tc>
+        <w:tc>
+          <w:tcPr>
+            <w:tcW w:type="dxa" w:w="1632"/>
+            <w:vAlign w:val="center"/>
+          </w:tcPr>
+          <w:p>
+            <w:r/>
+            <w:r>
+              <w:rPr>
+                <w:b w:val="0"/>
+                <w:sz w:val="18"/>
+              </w:rPr>
+              <w:t>启动、停止、冒烟和演示辅助脚本</w:t>
+            </w:r>
+          </w:p>
+        </w:tc>
+      </w:tr>
+      <w:tr>
+        <w:tc>
+          <w:tcPr>
+            <w:tcW w:type="dxa" w:w="1632"/>
+            <w:vAlign w:val="center"/>
+          </w:tcPr>
+          <w:p>
+            <w:r/>
+            <w:r>
+              <w:rPr>
+                <w:b w:val="0"/>
+                <w:sz w:val="18"/>
+              </w:rPr>
+              <w:t>CSS</w:t>
+            </w:r>
+          </w:p>
+        </w:tc>
+        <w:tc>
+          <w:tcPr>
+            <w:tcW w:type="dxa" w:w="1632"/>
+            <w:vAlign w:val="center"/>
+          </w:tcPr>
+          <w:p>
+            <w:r/>
+            <w:r>
+              <w:rPr>
+                <w:b w:val="0"/>
+                <w:sz w:val="18"/>
+              </w:rPr>
+              <w:t>.css</w:t>
+            </w:r>
+          </w:p>
+        </w:tc>
+        <w:tc>
+          <w:tcPr>
+            <w:tcW w:type="dxa" w:w="1632"/>
+            <w:vAlign w:val="center"/>
+          </w:tcPr>
+          <w:p>
+            <w:r/>
+            <w:r>
+              <w:rPr>
+                <w:b w:val="0"/>
+                <w:sz w:val="18"/>
+              </w:rPr>
+              <w:t>1</w:t>
+            </w:r>
+          </w:p>
+        </w:tc>
+        <w:tc>
+          <w:tcPr>
+            <w:tcW w:type="dxa" w:w="1632"/>
+            <w:vAlign w:val="center"/>
+          </w:tcPr>
+          <w:p>
+            <w:r/>
+            <w:r>
+              <w:rPr>
+                <w:b w:val="0"/>
+                <w:sz w:val="18"/>
+              </w:rPr>
+              <w:t>897</w:t>
+            </w:r>
+          </w:p>
+        </w:tc>
+        <w:tc>
+          <w:tcPr>
+            <w:tcW w:type="dxa" w:w="1632"/>
+            <w:vAlign w:val="center"/>
+          </w:tcPr>
+          <w:p>
+            <w:r/>
+            <w:r>
+              <w:rPr>
+                <w:b w:val="0"/>
+                <w:sz w:val="18"/>
+              </w:rPr>
+              <w:t>5.4%</w:t>
+            </w:r>
+          </w:p>
+        </w:tc>
+        <w:tc>
+          <w:tcPr>
+            <w:tcW w:type="dxa" w:w="1632"/>
+            <w:vAlign w:val="center"/>
+          </w:tcPr>
+          <w:p>
+            <w:r/>
+            <w:r>
+              <w:rPr>
+                <w:b w:val="0"/>
+                <w:sz w:val="18"/>
+              </w:rPr>
+              <w:t>统一页面样式</w:t>
+            </w:r>
+          </w:p>
+        </w:tc>
+      </w:tr>
+      <w:tr>
+        <w:tc>
+          <w:tcPr>
+            <w:tcW w:type="dxa" w:w="1632"/>
+            <w:vAlign w:val="center"/>
+          </w:tcPr>
+          <w:p>
+            <w:r/>
+            <w:r>
+              <w:rPr>
+                <w:b w:val="0"/>
+                <w:sz w:val="18"/>
+              </w:rPr>
+              <w:t>SQL</w:t>
+            </w:r>
+          </w:p>
+        </w:tc>
+        <w:tc>
+          <w:tcPr>
+            <w:tcW w:type="dxa" w:w="1632"/>
+            <w:vAlign w:val="center"/>
+          </w:tcPr>
+          <w:p>
+            <w:r/>
+            <w:r>
+              <w:rPr>
+                <w:b w:val="0"/>
+                <w:sz w:val="18"/>
+              </w:rPr>
+              <w:t>.sql</w:t>
+            </w:r>
+          </w:p>
+        </w:tc>
+        <w:tc>
+          <w:tcPr>
+            <w:tcW w:type="dxa" w:w="1632"/>
+            <w:vAlign w:val="center"/>
+          </w:tcPr>
+          <w:p>
+            <w:r/>
+            <w:r>
+              <w:rPr>
+                <w:b w:val="0"/>
+                <w:sz w:val="18"/>
+              </w:rPr>
+              <w:t>15</w:t>
+            </w:r>
+          </w:p>
+        </w:tc>
+        <w:tc>
+          <w:tcPr>
+            <w:tcW w:type="dxa" w:w="1632"/>
+            <w:vAlign w:val="center"/>
+          </w:tcPr>
+          <w:p>
+            <w:r/>
+            <w:r>
+              <w:rPr>
+                <w:b w:val="0"/>
+                <w:sz w:val="18"/>
+              </w:rPr>
+              <w:t>558</w:t>
+            </w:r>
+          </w:p>
+        </w:tc>
+        <w:tc>
+          <w:tcPr>
+            <w:tcW w:type="dxa" w:w="1632"/>
+            <w:vAlign w:val="center"/>
+          </w:tcPr>
+          <w:p>
+            <w:r/>
+            <w:r>
+              <w:rPr>
+                <w:b w:val="0"/>
+                <w:sz w:val="18"/>
+              </w:rPr>
+              <w:t>3.3%</w:t>
+            </w:r>
+          </w:p>
+        </w:tc>
+        <w:tc>
+          <w:tcPr>
+            <w:tcW w:type="dxa" w:w="1632"/>
+            <w:vAlign w:val="center"/>
+          </w:tcPr>
+          <w:p>
+            <w:r/>
+            <w:r>
+              <w:rPr>
+                <w:b w:val="0"/>
+                <w:sz w:val="18"/>
+              </w:rPr>
+              <w:t>Flyway 多数据库迁移</w:t>
+            </w:r>
+          </w:p>
+        </w:tc>
+      </w:tr>
+      <w:tr>
+        <w:tc>
+          <w:tcPr>
+            <w:tcW w:type="dxa" w:w="1632"/>
+            <w:vAlign w:val="center"/>
+          </w:tcPr>
+          <w:p>
+            <w:r/>
+            <w:r>
+              <w:rPr>
+                <w:b w:val="0"/>
+                <w:sz w:val="18"/>
+              </w:rPr>
+              <w:t>Python</w:t>
+            </w:r>
+          </w:p>
+        </w:tc>
+        <w:tc>
+          <w:tcPr>
+            <w:tcW w:type="dxa" w:w="1632"/>
+            <w:vAlign w:val="center"/>
+          </w:tcPr>
+          <w:p>
+            <w:r/>
+            <w:r>
+              <w:rPr>
+                <w:b w:val="0"/>
+                <w:sz w:val="18"/>
+              </w:rPr>
+              <w:t>.py</w:t>
+            </w:r>
+          </w:p>
+        </w:tc>
+        <w:tc>
+          <w:tcPr>
+            <w:tcW w:type="dxa" w:w="1632"/>
+            <w:vAlign w:val="center"/>
+          </w:tcPr>
+          <w:p>
+            <w:r/>
+            <w:r>
+              <w:rPr>
+                <w:b w:val="0"/>
+                <w:sz w:val="18"/>
+              </w:rPr>
+              <w:t>1</w:t>
+            </w:r>
+          </w:p>
+        </w:tc>
+        <w:tc>
+          <w:tcPr>
+            <w:tcW w:type="dxa" w:w="1632"/>
+            <w:vAlign w:val="center"/>
+          </w:tcPr>
+          <w:p>
+            <w:r/>
+            <w:r>
+              <w:rPr>
+                <w:b w:val="0"/>
+                <w:sz w:val="18"/>
+              </w:rPr>
+              <w:t>359</w:t>
+            </w:r>
+          </w:p>
+        </w:tc>
+        <w:tc>
+          <w:tcPr>
+            <w:tcW w:type="dxa" w:w="1632"/>
+            <w:vAlign w:val="center"/>
+          </w:tcPr>
+          <w:p>
+            <w:r/>
+            <w:r>
+              <w:rPr>
+                <w:b w:val="0"/>
+                <w:sz w:val="18"/>
+              </w:rPr>
+              <w:t>2.1%</w:t>
+            </w:r>
+          </w:p>
+        </w:tc>
+        <w:tc>
+          <w:tcPr>
+            <w:tcW w:type="dxa" w:w="1632"/>
+            <w:vAlign w:val="center"/>
+          </w:tcPr>
+          <w:p>
+            <w:r/>
+            <w:r>
+              <w:rPr>
+                <w:b w:val="0"/>
+                <w:sz w:val="18"/>
+              </w:rPr>
+              <w:t>状态机 BFS 验证脚本</w:t>
+            </w:r>
+          </w:p>
+        </w:tc>
+      </w:tr>
+      <w:tr>
+        <w:tc>
+          <w:tcPr>
+            <w:tcW w:type="dxa" w:w="1632"/>
+            <w:vAlign w:val="center"/>
+          </w:tcPr>
+          <w:p>
+            <w:r/>
+            <w:r>
+              <w:rPr>
+                <w:b w:val="0"/>
+                <w:sz w:val="18"/>
+              </w:rPr>
+              <w:t>JavaScript/YAML/XML/HTML</w:t>
+            </w:r>
+          </w:p>
+        </w:tc>
+        <w:tc>
+          <w:tcPr>
+            <w:tcW w:type="dxa" w:w="1632"/>
+            <w:vAlign w:val="center"/>
+          </w:tcPr>
+          <w:p>
+            <w:r/>
+            <w:r>
+              <w:rPr>
+                <w:b w:val="0"/>
+                <w:sz w:val="18"/>
+              </w:rPr>
+              <w:t>.js/.yml/.xml/.html</w:t>
+            </w:r>
+          </w:p>
+        </w:tc>
+        <w:tc>
+          <w:tcPr>
+            <w:tcW w:type="dxa" w:w="1632"/>
+            <w:vAlign w:val="center"/>
+          </w:tcPr>
+          <w:p>
+            <w:r/>
+            <w:r>
+              <w:rPr>
+                <w:b w:val="0"/>
+                <w:sz w:val="18"/>
+              </w:rPr>
+              <w:t>10</w:t>
+            </w:r>
+          </w:p>
+        </w:tc>
+        <w:tc>
+          <w:tcPr>
+            <w:tcW w:type="dxa" w:w="1632"/>
+            <w:vAlign w:val="center"/>
+          </w:tcPr>
+          <w:p>
+            <w:r/>
+            <w:r>
+              <w:rPr>
+                <w:b w:val="0"/>
+                <w:sz w:val="18"/>
+              </w:rPr>
+              <w:t>554</w:t>
+            </w:r>
+          </w:p>
+        </w:tc>
+        <w:tc>
+          <w:tcPr>
+            <w:tcW w:type="dxa" w:w="1632"/>
+            <w:vAlign w:val="center"/>
+          </w:tcPr>
+          <w:p>
+            <w:r/>
+            <w:r>
+              <w:rPr>
+                <w:b w:val="0"/>
+                <w:sz w:val="18"/>
+              </w:rPr>
+              <w:t>3.3%</w:t>
+            </w:r>
+          </w:p>
+        </w:tc>
+        <w:tc>
+          <w:tcPr>
+            <w:tcW w:type="dxa" w:w="1632"/>
+            <w:vAlign w:val="center"/>
+          </w:tcPr>
+          <w:p>
+            <w:r/>
+            <w:r>
+              <w:rPr>
+                <w:b w:val="0"/>
+                <w:sz w:val="18"/>
+              </w:rPr>
+              <w:t>前端入口、配置和构建描述</w:t>
+            </w:r>
+          </w:p>
+        </w:tc>
+      </w:tr>
+    </w:tbl>
+    <w:p/>
+    <w:p>
+      <w:pPr>
+        <w:pStyle w:val="Heading1"/>
+      </w:pPr>
+      <w:r>
+        <w:t>4. 时间进度安排</w:t>
       </w:r>
     </w:p>
     <w:p>
@@ -627,7 +2588,7 @@
         <w:pStyle w:val="Heading1"/>
       </w:pPr>
       <w:r>
-        <w:t>3. 分工安排</w:t>
+        <w:t>5. 分工安排与贡献比例</w:t>
       </w:r>
     </w:p>
     <w:tbl>
@@ -638,14 +2599,16 @@
         <w:tblLook w:firstColumn="1" w:firstRow="1" w:lastColumn="0" w:lastRow="0" w:noHBand="0" w:noVBand="1" w:val="04A0"/>
       </w:tblPr>
       <w:tblGrid>
-        <w:gridCol w:w="3264"/>
-        <w:gridCol w:w="3264"/>
-        <w:gridCol w:w="3264"/>
+        <w:gridCol w:w="1958"/>
+        <w:gridCol w:w="1958"/>
+        <w:gridCol w:w="1958"/>
+        <w:gridCol w:w="1958"/>
+        <w:gridCol w:w="1958"/>
       </w:tblGrid>
       <w:tr>
         <w:tc>
           <w:tcPr>
-            <w:tcW w:type="dxa" w:w="3264"/>
+            <w:tcW w:type="dxa" w:w="1958"/>
             <w:shd w:fill="F2F4F7"/>
             <w:vAlign w:val="center"/>
           </w:tcPr>
@@ -662,7 +2625,7 @@
         </w:tc>
         <w:tc>
           <w:tcPr>
-            <w:tcW w:type="dxa" w:w="3264"/>
+            <w:tcW w:type="dxa" w:w="1958"/>
             <w:shd w:fill="F2F4F7"/>
             <w:vAlign w:val="center"/>
           </w:tcPr>
@@ -673,13 +2636,13 @@
                 <w:b/>
                 <w:sz w:val="18"/>
               </w:rPr>
-              <w:t>职责</w:t>
+              <w:t>真实姓名</w:t>
             </w:r>
           </w:p>
         </w:tc>
         <w:tc>
           <w:tcPr>
-            <w:tcW w:type="dxa" w:w="3264"/>
+            <w:tcW w:type="dxa" w:w="1958"/>
             <w:shd w:fill="F2F4F7"/>
             <w:vAlign w:val="center"/>
           </w:tcPr>
@@ -690,7 +2653,41 @@
                 <w:b/>
                 <w:sz w:val="18"/>
               </w:rPr>
-              <w:t>当前姓名</w:t>
+              <w:t>贡献比例</w:t>
+            </w:r>
+          </w:p>
+        </w:tc>
+        <w:tc>
+          <w:tcPr>
+            <w:tcW w:type="dxa" w:w="1958"/>
+            <w:shd w:fill="F2F4F7"/>
+            <w:vAlign w:val="center"/>
+          </w:tcPr>
+          <w:p>
+            <w:r/>
+            <w:r>
+              <w:rPr>
+                <w:b/>
+                <w:sz w:val="18"/>
+              </w:rPr>
+              <w:t>主要职责</w:t>
+            </w:r>
+          </w:p>
+        </w:tc>
+        <w:tc>
+          <w:tcPr>
+            <w:tcW w:type="dxa" w:w="1958"/>
+            <w:shd w:fill="F2F4F7"/>
+            <w:vAlign w:val="center"/>
+          </w:tcPr>
+          <w:p>
+            <w:r/>
+            <w:r>
+              <w:rPr>
+                <w:b/>
+                <w:sz w:val="18"/>
+              </w:rPr>
+              <w:t>对应交付物</w:t>
             </w:r>
           </w:p>
         </w:tc>
@@ -698,7 +2695,7 @@
       <w:tr>
         <w:tc>
           <w:tcPr>
-            <w:tcW w:type="dxa" w:w="3264"/>
+            <w:tcW w:type="dxa" w:w="1958"/>
             <w:vAlign w:val="center"/>
           </w:tcPr>
           <w:p>
@@ -714,7 +2711,7 @@
         </w:tc>
         <w:tc>
           <w:tcPr>
-            <w:tcW w:type="dxa" w:w="3264"/>
+            <w:tcW w:type="dxa" w:w="1958"/>
             <w:vAlign w:val="center"/>
           </w:tcPr>
           <w:p>
@@ -724,13 +2721,13 @@
                 <w:b w:val="0"/>
                 <w:sz w:val="18"/>
               </w:rPr>
-              <w:t>范围确认、进度跟踪、汇报整合、风险管理</w:t>
+              <w:t>赵杰雄</w:t>
             </w:r>
           </w:p>
         </w:tc>
         <w:tc>
           <w:tcPr>
-            <w:tcW w:type="dxa" w:w="3264"/>
+            <w:tcW w:type="dxa" w:w="1958"/>
             <w:vAlign w:val="center"/>
           </w:tcPr>
           <w:p>
@@ -740,7 +2737,39 @@
                 <w:b w:val="0"/>
                 <w:sz w:val="18"/>
               </w:rPr>
-              <w:t>待补充</w:t>
+              <w:t>22%</w:t>
+            </w:r>
+          </w:p>
+        </w:tc>
+        <w:tc>
+          <w:tcPr>
+            <w:tcW w:type="dxa" w:w="1958"/>
+            <w:vAlign w:val="center"/>
+          </w:tcPr>
+          <w:p>
+            <w:r/>
+            <w:r>
+              <w:rPr>
+                <w:b w:val="0"/>
+                <w:sz w:val="18"/>
+              </w:rPr>
+              <w:t>范围确认、进度统筹、风险管理、文档整合、答辩组织</w:t>
+            </w:r>
+          </w:p>
+        </w:tc>
+        <w:tc>
+          <w:tcPr>
+            <w:tcW w:type="dxa" w:w="1958"/>
+            <w:vAlign w:val="center"/>
+          </w:tcPr>
+          <w:p>
+            <w:r/>
+            <w:r>
+              <w:rPr>
+                <w:b w:val="0"/>
+                <w:sz w:val="18"/>
+              </w:rPr>
+              <w:t>启动/关闭报告、结题 PPT、演示视频组织、里程碑与验收材料</w:t>
             </w:r>
           </w:p>
         </w:tc>
@@ -748,7 +2777,7 @@
       <w:tr>
         <w:tc>
           <w:tcPr>
-            <w:tcW w:type="dxa" w:w="3264"/>
+            <w:tcW w:type="dxa" w:w="1958"/>
             <w:vAlign w:val="center"/>
           </w:tcPr>
           <w:p>
@@ -764,7 +2793,7 @@
         </w:tc>
         <w:tc>
           <w:tcPr>
-            <w:tcW w:type="dxa" w:w="3264"/>
+            <w:tcW w:type="dxa" w:w="1958"/>
             <w:vAlign w:val="center"/>
           </w:tcPr>
           <w:p>
@@ -774,13 +2803,13 @@
                 <w:b w:val="0"/>
                 <w:sz w:val="18"/>
               </w:rPr>
-              <w:t>Spring Boot、权限、合同流程、附件、测试</w:t>
+              <w:t>谷友瑄</w:t>
             </w:r>
           </w:p>
         </w:tc>
         <w:tc>
           <w:tcPr>
-            <w:tcW w:type="dxa" w:w="3264"/>
+            <w:tcW w:type="dxa" w:w="1958"/>
             <w:vAlign w:val="center"/>
           </w:tcPr>
           <w:p>
@@ -790,7 +2819,39 @@
                 <w:b w:val="0"/>
                 <w:sz w:val="18"/>
               </w:rPr>
-              <w:t>待补充</w:t>
+              <w:t>22%</w:t>
+            </w:r>
+          </w:p>
+        </w:tc>
+        <w:tc>
+          <w:tcPr>
+            <w:tcW w:type="dxa" w:w="1958"/>
+            <w:vAlign w:val="center"/>
+          </w:tcPr>
+          <w:p>
+            <w:r/>
+            <w:r>
+              <w:rPr>
+                <w:b w:val="0"/>
+                <w:sz w:val="18"/>
+              </w:rPr>
+              <w:t>Spring Boot 工程、JWT/RBAC、合同状态机、附件上传、模板和统计接口</w:t>
+            </w:r>
+          </w:p>
+        </w:tc>
+        <w:tc>
+          <w:tcPr>
+            <w:tcW w:type="dxa" w:w="1958"/>
+            <w:vAlign w:val="center"/>
+          </w:tcPr>
+          <w:p>
+            <w:r/>
+            <w:r>
+              <w:rPr>
+                <w:b w:val="0"/>
+                <w:sz w:val="18"/>
+              </w:rPr>
+              <w:t>后端接口、领域服务、数据库迁移、权限校验、集成测试</w:t>
             </w:r>
           </w:p>
         </w:tc>
@@ -798,7 +2859,7 @@
       <w:tr>
         <w:tc>
           <w:tcPr>
-            <w:tcW w:type="dxa" w:w="3264"/>
+            <w:tcW w:type="dxa" w:w="1958"/>
             <w:vAlign w:val="center"/>
           </w:tcPr>
           <w:p>
@@ -814,7 +2875,7 @@
         </w:tc>
         <w:tc>
           <w:tcPr>
-            <w:tcW w:type="dxa" w:w="3264"/>
+            <w:tcW w:type="dxa" w:w="1958"/>
             <w:vAlign w:val="center"/>
           </w:tcPr>
           <w:p>
@@ -824,13 +2885,13 @@
                 <w:b w:val="0"/>
                 <w:sz w:val="18"/>
               </w:rPr>
-              <w:t>Vue 页面、路由权限、流程详情、演示交互</w:t>
+              <w:t>王凯</w:t>
             </w:r>
           </w:p>
         </w:tc>
         <w:tc>
           <w:tcPr>
-            <w:tcW w:type="dxa" w:w="3264"/>
+            <w:tcW w:type="dxa" w:w="1958"/>
             <w:vAlign w:val="center"/>
           </w:tcPr>
           <w:p>
@@ -840,7 +2901,39 @@
                 <w:b w:val="0"/>
                 <w:sz w:val="18"/>
               </w:rPr>
-              <w:t>待补充</w:t>
+              <w:t>21%</w:t>
+            </w:r>
+          </w:p>
+        </w:tc>
+        <w:tc>
+          <w:tcPr>
+            <w:tcW w:type="dxa" w:w="1958"/>
+            <w:vAlign w:val="center"/>
+          </w:tcPr>
+          <w:p>
+            <w:r/>
+            <w:r>
+              <w:rPr>
+                <w:b w:val="0"/>
+                <w:sz w:val="18"/>
+              </w:rPr>
+              <w:t>Vue 页面、路由权限、合同详情、流程可视化、查询统计和演示素材</w:t>
+            </w:r>
+          </w:p>
+        </w:tc>
+        <w:tc>
+          <w:tcPr>
+            <w:tcW w:type="dxa" w:w="1958"/>
+            <w:vAlign w:val="center"/>
+          </w:tcPr>
+          <w:p>
+            <w:r/>
+            <w:r>
+              <w:rPr>
+                <w:b w:val="0"/>
+                <w:sz w:val="18"/>
+              </w:rPr>
+              <w:t>前端页面、组件、交互状态、截图素材和用户手册配图</w:t>
             </w:r>
           </w:p>
         </w:tc>
@@ -848,7 +2941,7 @@
       <w:tr>
         <w:tc>
           <w:tcPr>
-            <w:tcW w:type="dxa" w:w="3264"/>
+            <w:tcW w:type="dxa" w:w="1958"/>
             <w:vAlign w:val="center"/>
           </w:tcPr>
           <w:p>
@@ -864,7 +2957,7 @@
         </w:tc>
         <w:tc>
           <w:tcPr>
-            <w:tcW w:type="dxa" w:w="3264"/>
+            <w:tcW w:type="dxa" w:w="1958"/>
             <w:vAlign w:val="center"/>
           </w:tcPr>
           <w:p>
@@ -874,13 +2967,13 @@
                 <w:b w:val="0"/>
                 <w:sz w:val="18"/>
               </w:rPr>
-              <w:t>测试用例、回归测试、Playwright 脚本、缺陷记录</w:t>
+              <w:t>项重善</w:t>
             </w:r>
           </w:p>
         </w:tc>
         <w:tc>
           <w:tcPr>
-            <w:tcW w:type="dxa" w:w="3264"/>
+            <w:tcW w:type="dxa" w:w="1958"/>
             <w:vAlign w:val="center"/>
           </w:tcPr>
           <w:p>
@@ -890,7 +2983,39 @@
                 <w:b w:val="0"/>
                 <w:sz w:val="18"/>
               </w:rPr>
-              <w:t>待补充</w:t>
+              <w:t>18%</w:t>
+            </w:r>
+          </w:p>
+        </w:tc>
+        <w:tc>
+          <w:tcPr>
+            <w:tcW w:type="dxa" w:w="1958"/>
+            <w:vAlign w:val="center"/>
+          </w:tcPr>
+          <w:p>
+            <w:r/>
+            <w:r>
+              <w:rPr>
+                <w:b w:val="0"/>
+                <w:sz w:val="18"/>
+              </w:rPr>
+              <w:t>测试用例、回归验证、Playwright 演示脚本、缺陷复核和验收记录</w:t>
+            </w:r>
+          </w:p>
+        </w:tc>
+        <w:tc>
+          <w:tcPr>
+            <w:tcW w:type="dxa" w:w="1958"/>
+            <w:vAlign w:val="center"/>
+          </w:tcPr>
+          <w:p>
+            <w:r/>
+            <w:r>
+              <w:rPr>
+                <w:b w:val="0"/>
+                <w:sz w:val="18"/>
+              </w:rPr>
+              <w:t>测试报告、回归清单、自动化验证记录、演示流程确认</w:t>
             </w:r>
           </w:p>
         </w:tc>
@@ -898,7 +3023,7 @@
       <w:tr>
         <w:tc>
           <w:tcPr>
-            <w:tcW w:type="dxa" w:w="3264"/>
+            <w:tcW w:type="dxa" w:w="1958"/>
             <w:vAlign w:val="center"/>
           </w:tcPr>
           <w:p>
@@ -914,7 +3039,7 @@
         </w:tc>
         <w:tc>
           <w:tcPr>
-            <w:tcW w:type="dxa" w:w="3264"/>
+            <w:tcW w:type="dxa" w:w="1958"/>
             <w:vAlign w:val="center"/>
           </w:tcPr>
           <w:p>
@@ -924,13 +3049,13 @@
                 <w:b w:val="0"/>
                 <w:sz w:val="18"/>
               </w:rPr>
-              <w:t>Flyway、Docker、启动脚本、部署说明</w:t>
+              <w:t>张浩然</w:t>
             </w:r>
           </w:p>
         </w:tc>
         <w:tc>
           <w:tcPr>
-            <w:tcW w:type="dxa" w:w="3264"/>
+            <w:tcW w:type="dxa" w:w="1958"/>
             <w:vAlign w:val="center"/>
           </w:tcPr>
           <w:p>
@@ -940,7 +3065,406 @@
                 <w:b w:val="0"/>
                 <w:sz w:val="18"/>
               </w:rPr>
-              <w:t>待补充</w:t>
+              <w:t>17%</w:t>
+            </w:r>
+          </w:p>
+        </w:tc>
+        <w:tc>
+          <w:tcPr>
+            <w:tcW w:type="dxa" w:w="1958"/>
+            <w:vAlign w:val="center"/>
+          </w:tcPr>
+          <w:p>
+            <w:r/>
+            <w:r>
+              <w:rPr>
+                <w:b w:val="0"/>
+                <w:sz w:val="18"/>
+              </w:rPr>
+              <w:t>Flyway 迁移、Docker Compose、启动停止脚本、演示数据和部署说明</w:t>
+            </w:r>
+          </w:p>
+        </w:tc>
+        <w:tc>
+          <w:tcPr>
+            <w:tcW w:type="dxa" w:w="1958"/>
+            <w:vAlign w:val="center"/>
+          </w:tcPr>
+          <w:p>
+            <w:r/>
+            <w:r>
+              <w:rPr>
+                <w:b w:val="0"/>
+                <w:sz w:val="18"/>
+              </w:rPr>
+              <w:t>数据库脚本、Docker 编排、start-demo/stop-demo、部署与运维说明</w:t>
+            </w:r>
+          </w:p>
+        </w:tc>
+      </w:tr>
+    </w:tbl>
+    <w:p/>
+    <w:p>
+      <w:r>
+        <w:t>贡献比例按任务复杂度、代码实现量、测试与文档投入、答辩材料产出综合估算，总计 100%。PPT 中给出的项目负责人、后端开发、前端开发、测试分工在此表中展开，数据库/运维作为支撑职责单列，便于启动报告和关闭报告保持一致。</w:t>
+      </w:r>
+    </w:p>
+    <w:p>
+      <w:r>
+        <w:br w:type="page"/>
+      </w:r>
+    </w:p>
+    <w:p>
+      <w:pPr>
+        <w:pStyle w:val="Heading1"/>
+      </w:pPr>
+      <w:r>
+        <w:t>6. 风险识别与启动应对</w:t>
+      </w:r>
+    </w:p>
+    <w:tbl>
+      <w:tblPr>
+        <w:tblStyle w:val="TableGrid"/>
+        <w:tblW w:type="auto" w:w="0"/>
+        <w:tblLayout w:type="autofit"/>
+        <w:tblLook w:firstColumn="1" w:firstRow="1" w:lastColumn="0" w:lastRow="0" w:noHBand="0" w:noVBand="1" w:val="04A0"/>
+      </w:tblPr>
+      <w:tblGrid>
+        <w:gridCol w:w="2448"/>
+        <w:gridCol w:w="2448"/>
+        <w:gridCol w:w="2448"/>
+        <w:gridCol w:w="2448"/>
+      </w:tblGrid>
+      <w:tr>
+        <w:tc>
+          <w:tcPr>
+            <w:tcW w:type="dxa" w:w="2448"/>
+            <w:shd w:fill="F2F4F7"/>
+            <w:vAlign w:val="center"/>
+          </w:tcPr>
+          <w:p>
+            <w:r/>
+            <w:r>
+              <w:rPr>
+                <w:b/>
+                <w:sz w:val="18"/>
+              </w:rPr>
+              <w:t>风险</w:t>
+            </w:r>
+          </w:p>
+        </w:tc>
+        <w:tc>
+          <w:tcPr>
+            <w:tcW w:type="dxa" w:w="2448"/>
+            <w:shd w:fill="F2F4F7"/>
+            <w:vAlign w:val="center"/>
+          </w:tcPr>
+          <w:p>
+            <w:r/>
+            <w:r>
+              <w:rPr>
+                <w:b/>
+                <w:sz w:val="18"/>
+              </w:rPr>
+              <w:t>影响</w:t>
+            </w:r>
+          </w:p>
+        </w:tc>
+        <w:tc>
+          <w:tcPr>
+            <w:tcW w:type="dxa" w:w="2448"/>
+            <w:shd w:fill="F2F4F7"/>
+            <w:vAlign w:val="center"/>
+          </w:tcPr>
+          <w:p>
+            <w:r/>
+            <w:r>
+              <w:rPr>
+                <w:b/>
+                <w:sz w:val="18"/>
+              </w:rPr>
+              <w:t>启动阶段应对</w:t>
+            </w:r>
+          </w:p>
+        </w:tc>
+        <w:tc>
+          <w:tcPr>
+            <w:tcW w:type="dxa" w:w="2448"/>
+            <w:shd w:fill="F2F4F7"/>
+            <w:vAlign w:val="center"/>
+          </w:tcPr>
+          <w:p>
+            <w:r/>
+            <w:r>
+              <w:rPr>
+                <w:b/>
+                <w:sz w:val="18"/>
+              </w:rPr>
+              <w:t>结题状态</w:t>
+            </w:r>
+          </w:p>
+        </w:tc>
+      </w:tr>
+      <w:tr>
+        <w:tc>
+          <w:tcPr>
+            <w:tcW w:type="dxa" w:w="2448"/>
+            <w:vAlign w:val="center"/>
+          </w:tcPr>
+          <w:p>
+            <w:r/>
+            <w:r>
+              <w:rPr>
+                <w:b w:val="0"/>
+                <w:sz w:val="18"/>
+              </w:rPr>
+              <w:t>合同状态机复杂</w:t>
+            </w:r>
+          </w:p>
+        </w:tc>
+        <w:tc>
+          <w:tcPr>
+            <w:tcW w:type="dxa" w:w="2448"/>
+            <w:vAlign w:val="center"/>
+          </w:tcPr>
+          <w:p>
+            <w:r/>
+            <w:r>
+              <w:rPr>
+                <w:b w:val="0"/>
+                <w:sz w:val="18"/>
+              </w:rPr>
+              <w:t>回退、撤回、多审批人容易导致流程卡死</w:t>
+            </w:r>
+          </w:p>
+        </w:tc>
+        <w:tc>
+          <w:tcPr>
+            <w:tcW w:type="dxa" w:w="2448"/>
+            <w:vAlign w:val="center"/>
+          </w:tcPr>
+          <w:p>
+            <w:r/>
+            <w:r>
+              <w:rPr>
+                <w:b w:val="0"/>
+                <w:sz w:val="18"/>
+              </w:rPr>
+              <w:t>先定义状态和任务表，再补集成测试</w:t>
+            </w:r>
+          </w:p>
+        </w:tc>
+        <w:tc>
+          <w:tcPr>
+            <w:tcW w:type="dxa" w:w="2448"/>
+            <w:vAlign w:val="center"/>
+          </w:tcPr>
+          <w:p>
+            <w:r/>
+            <w:r>
+              <w:rPr>
+                <w:b w:val="0"/>
+                <w:sz w:val="18"/>
+              </w:rPr>
+              <w:t>通过 currentRound、task.round 和 workflow_sim.py 做回归验证</w:t>
+            </w:r>
+          </w:p>
+        </w:tc>
+      </w:tr>
+      <w:tr>
+        <w:tc>
+          <w:tcPr>
+            <w:tcW w:type="dxa" w:w="2448"/>
+            <w:vAlign w:val="center"/>
+          </w:tcPr>
+          <w:p>
+            <w:r/>
+            <w:r>
+              <w:rPr>
+                <w:b w:val="0"/>
+                <w:sz w:val="18"/>
+              </w:rPr>
+              <w:t>权限边界漂移</w:t>
+            </w:r>
+          </w:p>
+        </w:tc>
+        <w:tc>
+          <w:tcPr>
+            <w:tcW w:type="dxa" w:w="2448"/>
+            <w:vAlign w:val="center"/>
+          </w:tcPr>
+          <w:p>
+            <w:r/>
+            <w:r>
+              <w:rPr>
+                <w:b w:val="0"/>
+                <w:sz w:val="18"/>
+              </w:rPr>
+              <w:t>前端可见但后端拒绝，或后端接口越权</w:t>
+            </w:r>
+          </w:p>
+        </w:tc>
+        <w:tc>
+          <w:tcPr>
+            <w:tcW w:type="dxa" w:w="2448"/>
+            <w:vAlign w:val="center"/>
+          </w:tcPr>
+          <w:p>
+            <w:r/>
+            <w:r>
+              <w:rPr>
+                <w:b w:val="0"/>
+                <w:sz w:val="18"/>
+              </w:rPr>
+              <w:t>统一权限点并要求接口二次校验</w:t>
+            </w:r>
+          </w:p>
+        </w:tc>
+        <w:tc>
+          <w:tcPr>
+            <w:tcW w:type="dxa" w:w="2448"/>
+            <w:vAlign w:val="center"/>
+          </w:tcPr>
+          <w:p>
+            <w:r/>
+            <w:r>
+              <w:rPr>
+                <w:b w:val="0"/>
+                <w:sz w:val="18"/>
+              </w:rPr>
+              <w:t>采用 JWT、RBAC、@RequirePermission 和业务归属校验</w:t>
+            </w:r>
+          </w:p>
+        </w:tc>
+      </w:tr>
+      <w:tr>
+        <w:tc>
+          <w:tcPr>
+            <w:tcW w:type="dxa" w:w="2448"/>
+            <w:vAlign w:val="center"/>
+          </w:tcPr>
+          <w:p>
+            <w:r/>
+            <w:r>
+              <w:rPr>
+                <w:b w:val="0"/>
+                <w:sz w:val="18"/>
+              </w:rPr>
+              <w:t>附件上传中断</w:t>
+            </w:r>
+          </w:p>
+        </w:tc>
+        <w:tc>
+          <w:tcPr>
+            <w:tcW w:type="dxa" w:w="2448"/>
+            <w:vAlign w:val="center"/>
+          </w:tcPr>
+          <w:p>
+            <w:r/>
+            <w:r>
+              <w:rPr>
+                <w:b w:val="0"/>
+                <w:sz w:val="18"/>
+              </w:rPr>
+              <w:t>较大文件失败后用户需要重新上传</w:t>
+            </w:r>
+          </w:p>
+        </w:tc>
+        <w:tc>
+          <w:tcPr>
+            <w:tcW w:type="dxa" w:w="2448"/>
+            <w:vAlign w:val="center"/>
+          </w:tcPr>
+          <w:p>
+            <w:r/>
+            <w:r>
+              <w:rPr>
+                <w:b w:val="0"/>
+                <w:sz w:val="18"/>
+              </w:rPr>
+              <w:t>普通上传先闭环，后续扩展续传</w:t>
+            </w:r>
+          </w:p>
+        </w:tc>
+        <w:tc>
+          <w:tcPr>
+            <w:tcW w:type="dxa" w:w="2448"/>
+            <w:vAlign w:val="center"/>
+          </w:tcPr>
+          <w:p>
+            <w:r/>
+            <w:r>
+              <w:rPr>
+                <w:b w:val="0"/>
+                <w:sz w:val="18"/>
+              </w:rPr>
+              <w:t>结题阶段补充分片会话、已传分片查询和 complete 合并</w:t>
+            </w:r>
+          </w:p>
+        </w:tc>
+      </w:tr>
+      <w:tr>
+        <w:tc>
+          <w:tcPr>
+            <w:tcW w:type="dxa" w:w="2448"/>
+            <w:vAlign w:val="center"/>
+          </w:tcPr>
+          <w:p>
+            <w:r/>
+            <w:r>
+              <w:rPr>
+                <w:b w:val="0"/>
+                <w:sz w:val="18"/>
+              </w:rPr>
+              <w:t>文档与代码脱节</w:t>
+            </w:r>
+          </w:p>
+        </w:tc>
+        <w:tc>
+          <w:tcPr>
+            <w:tcW w:type="dxa" w:w="2448"/>
+            <w:vAlign w:val="center"/>
+          </w:tcPr>
+          <w:p>
+            <w:r/>
+            <w:r>
+              <w:rPr>
+                <w:b w:val="0"/>
+                <w:sz w:val="18"/>
+              </w:rPr>
+              <w:t>答辩材料无法解释真实实现</w:t>
+            </w:r>
+          </w:p>
+        </w:tc>
+        <w:tc>
+          <w:tcPr>
+            <w:tcW w:type="dxa" w:w="2448"/>
+            <w:vAlign w:val="center"/>
+          </w:tcPr>
+          <w:p>
+            <w:r/>
+            <w:r>
+              <w:rPr>
+                <w:b w:val="0"/>
+                <w:sz w:val="18"/>
+              </w:rPr>
+              <w:t>文档跟随阶段里程碑更新</w:t>
+            </w:r>
+          </w:p>
+        </w:tc>
+        <w:tc>
+          <w:tcPr>
+            <w:tcW w:type="dxa" w:w="2448"/>
+            <w:vAlign w:val="center"/>
+          </w:tcPr>
+          <w:p>
+            <w:r/>
+            <w:r>
+              <w:rPr>
+                <w:b w:val="0"/>
+                <w:sz w:val="18"/>
+              </w:rPr>
+              <w:t>六份报告、PPT 和 MP4 均围绕实际功能与测试证据组织</w:t>
             </w:r>
           </w:p>
         </w:tc>

</xml_diff>